<commit_message>
Objava na Fly.io iz preglednika (GitHub Action), Dockerfile bez USER node zbog vlasništva /data, upute v1.1
Co-Authored-By: Claude Fable 5.1 <noreply@anthropic.com>
Claude-Session: https://claude.ai/code/session_01N6osGTndKZcV7Vv1JmTaUH
</commit_message>
<xml_diff>
--- a/docs/UPUTE-Fly.io.docx
+++ b/docs/UPUTE-Fly.io.docx
@@ -23,7 +23,7 @@
           <w:sz w:val="22"/>
           <w:szCs w:val="22"/>
         </w:rPr>
-        <w:t xml:space="preserve">Upute za netehničara. Verzija 1.0, rujan 2026. Trajanje: oko 30 minuta prvi put, kasnije 5 minuta po nadogradnji.</w:t>
+        <w:t xml:space="preserve">Upute za netehničara. Verzija 1.1, rujan 2026. Put A ne traži nikakvu instalaciju na računalu; sve se radi u pregledniku. Trajanje: oko 20 minuta prvi put, kasnije jedan klik po nadogradnji.</w:t>
       </w:r>
     </w:p>
     <w:p>
@@ -61,7 +61,7 @@
           <w:sz w:val="22"/>
           <w:szCs w:val="22"/>
         </w:rPr>
-        <w:t xml:space="preserve">Ne trebate instalirati Docker ni bilo što složeno. Trebate: računalo (Mac ili Windows), pristup Terminalu odnosno PowerShellu, e-poštu i platnu karticu za Fly.io.</w:t>
+        <w:t xml:space="preserve">Postoje dva puta. Put A ne traži nikakvu instalaciju: sve se radi klikanjem u pregledniku, na GitHubu i Fly.io. Put B koristi naredbu fly na vlastitom računalu i traži instalaciju jednog programa. Za Windows bez administratorskih prava vrijedi Put A. U oba slučaja trebate e-poštu, GitHub račun (već ga imate) i platnu karticu za Fly.io.</w:t>
       </w:r>
     </w:p>
     <w:p>
@@ -360,7 +360,7 @@
         </w:rPr>
         <w:t xml:space="preserve">Izvor cijena: </w:t>
       </w:r>
-      <w:hyperlink w:history="1" r:id="rIdyls-yjfuadfvmm8n-rs8w">
+      <w:hyperlink w:history="1" r:id="rIdyuocd2vxknhaapsqwsjy5">
         <w:r>
           <w:rPr>
             <w:rStyle w:val="Hyperlink"/>
@@ -379,7 +379,7 @@
         </w:rPr>
         <w:t xml:space="preserve"> i </w:t>
       </w:r>
-      <w:hyperlink w:history="1" r:id="rId5fvne0_g3fo22jhioiib2">
+      <w:hyperlink w:history="1" r:id="rIdw8rvajpv-cols27ytvr0f">
         <w:r>
           <w:rPr>
             <w:rStyle w:val="Hyperlink"/>
@@ -408,7 +408,20 @@
         <w:rPr>
           <w:rFonts w:ascii="Calibri" w:cs="Calibri" w:eastAsia="Calibri" w:hAnsi="Calibri"/>
         </w:rPr>
-        <w:t xml:space="preserve">2. Priprema (jednom)</w:t>
+        <w:t xml:space="preserve">2. Put A: bez ikakve instalacije, sve u pregledniku (preporučeno)</w:t>
+      </w:r>
+    </w:p>
+    <w:p>
+      <w:pPr>
+        <w:spacing w:after="120"/>
+      </w:pPr>
+      <w:r>
+        <w:rPr>
+          <w:rFonts w:ascii="Calibri" w:cs="Calibri" w:eastAsia="Calibri" w:hAnsi="Calibri"/>
+          <w:sz w:val="22"/>
+          <w:szCs w:val="22"/>
+        </w:rPr>
+        <w:t xml:space="preserve">Objavu na Fly.io umjesto vašeg računala obavlja GitHub, na svojim računalima. Vi samo klikate u pregledniku. Ništa se ne instalira, pa ne trebaju administratorska prava. Trajanje prvi put: oko 20 minuta, od čega 10 minuta čeka na gradnju.</w:t>
       </w:r>
     </w:p>
     <w:p>
@@ -420,87 +433,87 @@
         <w:rPr>
           <w:rFonts w:ascii="Calibri" w:cs="Calibri" w:eastAsia="Calibri" w:hAnsi="Calibri"/>
         </w:rPr>
-        <w:t xml:space="preserve">2.1. Preuzmite aplikaciju s GitHuba</w:t>
-      </w:r>
-    </w:p>
-    <w:p>
-      <w:pPr>
-        <w:pStyle w:val="ListParagraph"/>
-        <w:numPr>
-          <w:ilvl w:val="0"/>
-          <w:numId w:val="2"/>
-        </w:numPr>
-        <w:spacing w:after="100"/>
-      </w:pPr>
-      <w:r>
-        <w:rPr>
-          <w:rFonts w:ascii="Calibri" w:cs="Calibri" w:eastAsia="Calibri" w:hAnsi="Calibri"/>
-          <w:b w:val="false"/>
-          <w:bCs w:val="false"/>
-          <w:sz w:val="22"/>
-          <w:szCs w:val="22"/>
-        </w:rPr>
-        <w:t xml:space="preserve">Prijavite se na github.com i otvorite repozitorij ldanijel/tlak.</w:t>
-      </w:r>
-    </w:p>
-    <w:p>
-      <w:pPr>
-        <w:pStyle w:val="ListParagraph"/>
-        <w:numPr>
-          <w:ilvl w:val="0"/>
-          <w:numId w:val="2"/>
-        </w:numPr>
-        <w:spacing w:after="100"/>
-      </w:pPr>
-      <w:r>
-        <w:rPr>
-          <w:rFonts w:ascii="Calibri" w:cs="Calibri" w:eastAsia="Calibri" w:hAnsi="Calibri"/>
-          <w:b w:val="false"/>
-          <w:bCs w:val="false"/>
-          <w:sz w:val="22"/>
-          <w:szCs w:val="22"/>
-        </w:rPr>
-        <w:t xml:space="preserve">Iznad popisa datoteka odaberite granu claude/online-storage-multi-device-qgm6qu (padajući izbornik s nazivom grane).</w:t>
-      </w:r>
-    </w:p>
-    <w:p>
-      <w:pPr>
-        <w:pStyle w:val="ListParagraph"/>
-        <w:numPr>
-          <w:ilvl w:val="0"/>
-          <w:numId w:val="2"/>
-        </w:numPr>
-        <w:spacing w:after="100"/>
-      </w:pPr>
-      <w:r>
-        <w:rPr>
-          <w:rFonts w:ascii="Calibri" w:cs="Calibri" w:eastAsia="Calibri" w:hAnsi="Calibri"/>
-          <w:b w:val="false"/>
-          <w:bCs w:val="false"/>
-          <w:sz w:val="22"/>
-          <w:szCs w:val="22"/>
-        </w:rPr>
-        <w:t xml:space="preserve">Kliknite zeleni gumb Code, zatim Download ZIP.</w:t>
-      </w:r>
-    </w:p>
-    <w:p>
-      <w:pPr>
-        <w:pStyle w:val="ListParagraph"/>
-        <w:numPr>
-          <w:ilvl w:val="0"/>
-          <w:numId w:val="2"/>
-        </w:numPr>
-        <w:spacing w:after="100"/>
-      </w:pPr>
-      <w:r>
-        <w:rPr>
-          <w:rFonts w:ascii="Calibri" w:cs="Calibri" w:eastAsia="Calibri" w:hAnsi="Calibri"/>
-          <w:b w:val="false"/>
-          <w:bCs w:val="false"/>
-          <w:sz w:val="22"/>
-          <w:szCs w:val="22"/>
-        </w:rPr>
-        <w:t xml:space="preserve">Raspakirajte ZIP. Dobit ćete mapu, npr. tlak-claude-online-storage-multi-device-qgm6qu. Preimenujte je u tlak i stavite u Dokumente.</w:t>
+        <w:t xml:space="preserve">2.1. Otvorite račun na Fly.io i napravite „deploy token”</w:t>
+      </w:r>
+    </w:p>
+    <w:p>
+      <w:pPr>
+        <w:pStyle w:val="ListParagraph"/>
+        <w:numPr>
+          <w:ilvl w:val="0"/>
+          <w:numId w:val="2"/>
+        </w:numPr>
+        <w:spacing w:after="100"/>
+      </w:pPr>
+      <w:r>
+        <w:rPr>
+          <w:rFonts w:ascii="Calibri" w:cs="Calibri" w:eastAsia="Calibri" w:hAnsi="Calibri"/>
+          <w:b w:val="false"/>
+          <w:bCs w:val="false"/>
+          <w:sz w:val="22"/>
+          <w:szCs w:val="22"/>
+        </w:rPr>
+        <w:t xml:space="preserve">U pregledniku otvorite fly.io i kliknite Sign Up. Registrirajte se e-poštom ili GitHub računom. Fly.io traži platnu karticu; unesite je.</w:t>
+      </w:r>
+    </w:p>
+    <w:p>
+      <w:pPr>
+        <w:pStyle w:val="ListParagraph"/>
+        <w:numPr>
+          <w:ilvl w:val="0"/>
+          <w:numId w:val="2"/>
+        </w:numPr>
+        <w:spacing w:after="100"/>
+      </w:pPr>
+      <w:r>
+        <w:rPr>
+          <w:rFonts w:ascii="Calibri" w:cs="Calibri" w:eastAsia="Calibri" w:hAnsi="Calibri"/>
+          <w:b w:val="false"/>
+          <w:bCs w:val="false"/>
+          <w:sz w:val="22"/>
+          <w:szCs w:val="22"/>
+        </w:rPr>
+        <w:t xml:space="preserve">Kad ste prijavljeni, otvorite fly.io/dashboard. U lijevom izborniku ili pod postavkama organizacije pronađite Tokens (ili Account → Access Tokens).</w:t>
+      </w:r>
+    </w:p>
+    <w:p>
+      <w:pPr>
+        <w:pStyle w:val="ListParagraph"/>
+        <w:numPr>
+          <w:ilvl w:val="0"/>
+          <w:numId w:val="2"/>
+        </w:numPr>
+        <w:spacing w:after="100"/>
+      </w:pPr>
+      <w:r>
+        <w:rPr>
+          <w:rFonts w:ascii="Calibri" w:cs="Calibri" w:eastAsia="Calibri" w:hAnsi="Calibri"/>
+          <w:b w:val="false"/>
+          <w:bCs w:val="false"/>
+          <w:sz w:val="22"/>
+          <w:szCs w:val="22"/>
+        </w:rPr>
+        <w:t xml:space="preserve">Kliknite Create token (Create deploy token). Naziv upišite npr. github-tlak, istek ostavite kako je ponuđeno ili postavite dulji. Kliknite Create.</w:t>
+      </w:r>
+    </w:p>
+    <w:p>
+      <w:pPr>
+        <w:pStyle w:val="ListParagraph"/>
+        <w:numPr>
+          <w:ilvl w:val="0"/>
+          <w:numId w:val="2"/>
+        </w:numPr>
+        <w:spacing w:after="100"/>
+      </w:pPr>
+      <w:r>
+        <w:rPr>
+          <w:rFonts w:ascii="Calibri" w:cs="Calibri" w:eastAsia="Calibri" w:hAnsi="Calibri"/>
+          <w:b w:val="false"/>
+          <w:bCs w:val="false"/>
+          <w:sz w:val="22"/>
+          <w:szCs w:val="22"/>
+        </w:rPr>
+        <w:t xml:space="preserve">Kopirajte prikazani niz znakova koji počinje s FlyV1. Prikazuje se samo jednom; ako ga izgubite, napravite novi.</w:t>
       </w:r>
     </w:p>
     <w:p>
@@ -519,7 +532,7 @@
           <w:sz w:val="21"/>
           <w:szCs w:val="21"/>
         </w:rPr>
-        <w:t xml:space="preserve">Kad kasnije spojimo granu u glavnu (main), preuzimat ćete ZIP s glavne grane, bez biranja grane.</w:t>
+        <w:t xml:space="preserve">Token je kao ključ od stana. Ne šaljite ga nikome i ne zapisujte na javna mjesta. Zalijepit ćete ga samo u GitHub tajnu u idućem koraku.</w:t>
       </w:r>
     </w:p>
     <w:p>
@@ -531,119 +544,107 @@
         <w:rPr>
           <w:rFonts w:ascii="Calibri" w:cs="Calibri" w:eastAsia="Calibri" w:hAnsi="Calibri"/>
         </w:rPr>
-        <w:t xml:space="preserve">2.2. Instalirajte alat flyctl</w:t>
-      </w:r>
-    </w:p>
-    <w:p>
-      <w:pPr>
-        <w:spacing w:after="120"/>
-      </w:pPr>
-      <w:r>
-        <w:rPr>
-          <w:rFonts w:ascii="Calibri" w:cs="Calibri" w:eastAsia="Calibri" w:hAnsi="Calibri"/>
-          <w:sz w:val="22"/>
-          <w:szCs w:val="22"/>
-        </w:rPr>
-        <w:t xml:space="preserve">Flyctl je mali program kojim se naredbama upravlja računalom u oblaku. Otvorite Terminal (Mac: Aplikacije → Uslužni programi → Terminal) ili PowerShell (Windows: tipka Windows, upišite PowerShell, Enter). Zalijepite naredbu i pritisnite Enter.</w:t>
-      </w:r>
-    </w:p>
-    <w:p>
-      <w:pPr>
-        <w:spacing w:after="120"/>
-      </w:pPr>
-      <w:r>
-        <w:rPr>
-          <w:rFonts w:ascii="Calibri" w:cs="Calibri" w:eastAsia="Calibri" w:hAnsi="Calibri"/>
-          <w:b/>
-          <w:bCs/>
-          <w:sz w:val="22"/>
-          <w:szCs w:val="22"/>
-        </w:rPr>
-        <w:t xml:space="preserve">Mac:</w:t>
-      </w:r>
-    </w:p>
-    <w:p>
-      <w:pPr>
-        <w:shd w:fill="F2F2F2" w:color="auto" w:val="clear"/>
-        <w:spacing w:after="120"/>
-        <w:ind w:left="360"/>
-      </w:pPr>
-      <w:r>
-        <w:rPr>
-          <w:rFonts w:ascii="Consolas" w:cs="Consolas" w:eastAsia="Consolas" w:hAnsi="Consolas"/>
-          <w:sz w:val="20"/>
-          <w:szCs w:val="20"/>
-        </w:rPr>
-        <w:t xml:space="preserve">curl -L https://fly.io/install.sh | sh</w:t>
-      </w:r>
-    </w:p>
-    <w:p>
-      <w:pPr>
-        <w:spacing w:after="120"/>
-      </w:pPr>
-      <w:r>
-        <w:rPr>
-          <w:rFonts w:ascii="Calibri" w:cs="Calibri" w:eastAsia="Calibri" w:hAnsi="Calibri"/>
-          <w:sz w:val="22"/>
-          <w:szCs w:val="22"/>
-        </w:rPr>
-        <w:t xml:space="preserve">Nakon instalacije zatvorite Terminal i otvorite ga ponovno da bi naredba fly postala dostupna.</w:t>
-      </w:r>
-    </w:p>
-    <w:p>
-      <w:pPr>
-        <w:spacing w:after="120"/>
-      </w:pPr>
-      <w:r>
-        <w:rPr>
-          <w:rFonts w:ascii="Calibri" w:cs="Calibri" w:eastAsia="Calibri" w:hAnsi="Calibri"/>
-          <w:b/>
-          <w:bCs/>
-          <w:sz w:val="22"/>
-          <w:szCs w:val="22"/>
-        </w:rPr>
-        <w:t xml:space="preserve">Windows (PowerShell):</w:t>
-      </w:r>
-    </w:p>
-    <w:p>
-      <w:pPr>
-        <w:shd w:fill="F2F2F2" w:color="auto" w:val="clear"/>
-        <w:spacing w:after="120"/>
-        <w:ind w:left="360"/>
-      </w:pPr>
-      <w:r>
-        <w:rPr>
-          <w:rFonts w:ascii="Consolas" w:cs="Consolas" w:eastAsia="Consolas" w:hAnsi="Consolas"/>
-          <w:sz w:val="20"/>
-          <w:szCs w:val="20"/>
-        </w:rPr>
-        <w:t xml:space="preserve">pwsh -Command "iwr https://fly.io/install.ps1 -useb | iex"</w:t>
-      </w:r>
-    </w:p>
-    <w:p>
-      <w:pPr>
-        <w:spacing w:after="120"/>
-      </w:pPr>
-      <w:r>
-        <w:rPr>
-          <w:rFonts w:ascii="Calibri" w:cs="Calibri" w:eastAsia="Calibri" w:hAnsi="Calibri"/>
-          <w:sz w:val="22"/>
-          <w:szCs w:val="22"/>
-        </w:rPr>
-        <w:t xml:space="preserve">Ako Windows javi da pwsh ne postoji, zalijepite samo dio unutar navodnika: iwr https://fly.io/install.ps1 -useb | iex. Nakon toga zatvorite i ponovno otvorite PowerShell.</w:t>
-      </w:r>
-    </w:p>
-    <w:p>
-      <w:pPr>
-        <w:spacing w:after="120"/>
-      </w:pPr>
-      <w:r>
-        <w:rPr>
-          <w:rFonts w:ascii="Calibri" w:cs="Calibri" w:eastAsia="Calibri" w:hAnsi="Calibri"/>
-          <w:sz w:val="22"/>
-          <w:szCs w:val="22"/>
-        </w:rPr>
-        <w:t xml:space="preserve">Provjera: upišite fly version. Ako se ispiše broj verzije, spremni ste.</w:t>
+        <w:t xml:space="preserve">2.2. Upišite tajne u GitHub</w:t>
+      </w:r>
+    </w:p>
+    <w:p>
+      <w:pPr>
+        <w:pStyle w:val="ListParagraph"/>
+        <w:numPr>
+          <w:ilvl w:val="0"/>
+          <w:numId w:val="2"/>
+        </w:numPr>
+        <w:spacing w:after="100"/>
+      </w:pPr>
+      <w:r>
+        <w:rPr>
+          <w:rFonts w:ascii="Calibri" w:cs="Calibri" w:eastAsia="Calibri" w:hAnsi="Calibri"/>
+          <w:b w:val="false"/>
+          <w:bCs w:val="false"/>
+          <w:sz w:val="22"/>
+          <w:szCs w:val="22"/>
+        </w:rPr>
+        <w:t xml:space="preserve">Otvorite github.com/ldanijel/tlak, zatim karticu Settings (gore desno, zupčanik).</w:t>
+      </w:r>
+    </w:p>
+    <w:p>
+      <w:pPr>
+        <w:pStyle w:val="ListParagraph"/>
+        <w:numPr>
+          <w:ilvl w:val="0"/>
+          <w:numId w:val="2"/>
+        </w:numPr>
+        <w:spacing w:after="100"/>
+      </w:pPr>
+      <w:r>
+        <w:rPr>
+          <w:rFonts w:ascii="Calibri" w:cs="Calibri" w:eastAsia="Calibri" w:hAnsi="Calibri"/>
+          <w:b w:val="false"/>
+          <w:bCs w:val="false"/>
+          <w:sz w:val="22"/>
+          <w:szCs w:val="22"/>
+        </w:rPr>
+        <w:t xml:space="preserve">U lijevom izborniku: Secrets and variables → Actions.</w:t>
+      </w:r>
+    </w:p>
+    <w:p>
+      <w:pPr>
+        <w:pStyle w:val="ListParagraph"/>
+        <w:numPr>
+          <w:ilvl w:val="0"/>
+          <w:numId w:val="2"/>
+        </w:numPr>
+        <w:spacing w:after="100"/>
+      </w:pPr>
+      <w:r>
+        <w:rPr>
+          <w:rFonts w:ascii="Calibri" w:cs="Calibri" w:eastAsia="Calibri" w:hAnsi="Calibri"/>
+          <w:b w:val="false"/>
+          <w:bCs w:val="false"/>
+          <w:sz w:val="22"/>
+          <w:szCs w:val="22"/>
+        </w:rPr>
+        <w:t xml:space="preserve">Kliknite New repository secret. Name: FLY_API_TOKEN. Secret: zalijepite token iz koraka 2.1. Add secret.</w:t>
+      </w:r>
+    </w:p>
+    <w:p>
+      <w:pPr>
+        <w:pStyle w:val="ListParagraph"/>
+        <w:numPr>
+          <w:ilvl w:val="0"/>
+          <w:numId w:val="2"/>
+        </w:numPr>
+        <w:spacing w:after="100"/>
+      </w:pPr>
+      <w:r>
+        <w:rPr>
+          <w:rFonts w:ascii="Calibri" w:cs="Calibri" w:eastAsia="Calibri" w:hAnsi="Calibri"/>
+          <w:b w:val="false"/>
+          <w:bCs w:val="false"/>
+          <w:sz w:val="22"/>
+          <w:szCs w:val="22"/>
+        </w:rPr>
+        <w:t xml:space="preserve">Ponovno New repository secret. Name: INVITE_CODE. Secret: izmislite pozivni kod bez razmaka, npr. obitelj-2026. Add secret. Ovaj kod dajete ukućanima; bez njega nitko ne može otvoriti račun.</w:t>
+      </w:r>
+    </w:p>
+    <w:p>
+      <w:pPr>
+        <w:pStyle w:val="ListParagraph"/>
+        <w:numPr>
+          <w:ilvl w:val="0"/>
+          <w:numId w:val="2"/>
+        </w:numPr>
+        <w:spacing w:after="100"/>
+      </w:pPr>
+      <w:r>
+        <w:rPr>
+          <w:rFonts w:ascii="Calibri" w:cs="Calibri" w:eastAsia="Calibri" w:hAnsi="Calibri"/>
+          <w:b w:val="false"/>
+          <w:bCs w:val="false"/>
+          <w:sz w:val="22"/>
+          <w:szCs w:val="22"/>
+        </w:rPr>
+        <w:t xml:space="preserve">Kartica Variables (pokraj Secrets) → New repository variable. Name: FLY_APP_NAME. Value: jedinstven naziv vaše aplikacije, mala slova, brojke i crtice, npr. tlak-prezime. Adresa će biti https://tlak-prezime.fly.dev. Add variable.</w:t>
       </w:r>
     </w:p>
     <w:p>
@@ -655,257 +656,107 @@
         <w:rPr>
           <w:rFonts w:ascii="Calibri" w:cs="Calibri" w:eastAsia="Calibri" w:hAnsi="Calibri"/>
         </w:rPr>
-        <w:t xml:space="preserve">2.3. Otvorite račun na Fly.io</w:t>
-      </w:r>
-    </w:p>
-    <w:p>
-      <w:pPr>
-        <w:shd w:fill="F2F2F2" w:color="auto" w:val="clear"/>
-        <w:spacing w:after="120"/>
-        <w:ind w:left="360"/>
-      </w:pPr>
-      <w:r>
-        <w:rPr>
-          <w:rFonts w:ascii="Consolas" w:cs="Consolas" w:eastAsia="Consolas" w:hAnsi="Consolas"/>
-          <w:sz w:val="20"/>
-          <w:szCs w:val="20"/>
-        </w:rPr>
-        <w:t xml:space="preserve">fly auth signup</w:t>
-      </w:r>
-    </w:p>
-    <w:p>
-      <w:pPr>
-        <w:spacing w:after="120"/>
-      </w:pPr>
-      <w:r>
-        <w:rPr>
-          <w:rFonts w:ascii="Calibri" w:cs="Calibri" w:eastAsia="Calibri" w:hAnsi="Calibri"/>
-          <w:sz w:val="22"/>
-          <w:szCs w:val="22"/>
-        </w:rPr>
-        <w:t xml:space="preserve">Otvorit će se preglednik. Registrirajte se e-poštom ili GitHub računom i unesite platnu karticu (Fly.io je traži i za male iznose). Vratite se u Terminal; ispisat će „successfully logged in”.</w:t>
-      </w:r>
-    </w:p>
-    <w:p>
-      <w:pPr>
-        <w:pStyle w:val="Heading1"/>
-        <w:spacing w:after="120" w:before="360"/>
-      </w:pPr>
-      <w:r>
-        <w:rPr>
-          <w:rFonts w:ascii="Calibri" w:cs="Calibri" w:eastAsia="Calibri" w:hAnsi="Calibri"/>
-        </w:rPr>
-        <w:t xml:space="preserve">3. Prvo postavljanje (jednom, oko 15 minuta)</w:t>
-      </w:r>
-    </w:p>
-    <w:p>
-      <w:pPr>
-        <w:pStyle w:val="ListParagraph"/>
-        <w:numPr>
-          <w:ilvl w:val="0"/>
-          <w:numId w:val="2"/>
-        </w:numPr>
-        <w:spacing w:after="100"/>
-      </w:pPr>
-      <w:r>
-        <w:rPr>
-          <w:rFonts w:ascii="Calibri" w:cs="Calibri" w:eastAsia="Calibri" w:hAnsi="Calibri"/>
-          <w:b w:val="false"/>
-          <w:bCs w:val="false"/>
-          <w:sz w:val="22"/>
-          <w:szCs w:val="22"/>
-        </w:rPr>
-        <w:t xml:space="preserve">U Terminalu uđite u mapu aplikacije. Mac: cd ~/Documents/tlak. Windows: cd $HOME\Documents\tlak.</w:t>
-      </w:r>
-    </w:p>
-    <w:p>
-      <w:pPr>
-        <w:pStyle w:val="ListParagraph"/>
-        <w:numPr>
-          <w:ilvl w:val="0"/>
-          <w:numId w:val="2"/>
-        </w:numPr>
-        <w:spacing w:after="100"/>
-      </w:pPr>
-      <w:r>
-        <w:rPr>
-          <w:rFonts w:ascii="Calibri" w:cs="Calibri" w:eastAsia="Calibri" w:hAnsi="Calibri"/>
-          <w:b w:val="false"/>
-          <w:bCs w:val="false"/>
-          <w:sz w:val="22"/>
-          <w:szCs w:val="22"/>
-        </w:rPr>
-        <w:t xml:space="preserve">Pokrenite:</w:t>
-      </w:r>
-    </w:p>
-    <w:p>
-      <w:pPr>
-        <w:shd w:fill="F2F2F2" w:color="auto" w:val="clear"/>
-        <w:spacing w:after="120"/>
-        <w:ind w:left="360"/>
-      </w:pPr>
-      <w:r>
-        <w:rPr>
-          <w:rFonts w:ascii="Consolas" w:cs="Consolas" w:eastAsia="Consolas" w:hAnsi="Consolas"/>
-          <w:sz w:val="20"/>
-          <w:szCs w:val="20"/>
-        </w:rPr>
-        <w:t xml:space="preserve">fly launch --copy-config --no-deploy</w:t>
-      </w:r>
-    </w:p>
-    <w:p>
-      <w:pPr>
-        <w:spacing w:after="120"/>
-      </w:pPr>
-      <w:r>
-        <w:rPr>
-          <w:rFonts w:ascii="Calibri" w:cs="Calibri" w:eastAsia="Calibri" w:hAnsi="Calibri"/>
-          <w:sz w:val="22"/>
-          <w:szCs w:val="22"/>
-        </w:rPr>
-        <w:t xml:space="preserve">Odgovori na pitanja:</w:t>
-      </w:r>
-    </w:p>
-    <w:p>
-      <w:pPr>
-        <w:pStyle w:val="ListParagraph"/>
-        <w:numPr>
-          <w:ilvl w:val="0"/>
-          <w:numId w:val="3"/>
-        </w:numPr>
-        <w:spacing w:after="80"/>
-      </w:pPr>
-      <w:r>
-        <w:rPr>
-          <w:rFonts w:ascii="Calibri" w:cs="Calibri" w:eastAsia="Calibri" w:hAnsi="Calibri"/>
-          <w:sz w:val="22"/>
-          <w:szCs w:val="22"/>
-        </w:rPr>
-        <w:t xml:space="preserve">App name: upišite jedinstven naziv, npr. tlak-prezime (mala slova, brojke, crtice). Adresa će biti https://tlak-prezime.fly.dev.</w:t>
-      </w:r>
-    </w:p>
-    <w:p>
-      <w:pPr>
-        <w:pStyle w:val="ListParagraph"/>
-        <w:numPr>
-          <w:ilvl w:val="0"/>
-          <w:numId w:val="3"/>
-        </w:numPr>
-        <w:spacing w:after="80"/>
-      </w:pPr>
-      <w:r>
-        <w:rPr>
-          <w:rFonts w:ascii="Calibri" w:cs="Calibri" w:eastAsia="Calibri" w:hAnsi="Calibri"/>
-          <w:sz w:val="22"/>
-          <w:szCs w:val="22"/>
-        </w:rPr>
-        <w:t xml:space="preserve">Region: odaberite Frankfurt (fra), najbliže Hrvatskoj.</w:t>
-      </w:r>
-    </w:p>
-    <w:p>
-      <w:pPr>
-        <w:pStyle w:val="ListParagraph"/>
-        <w:numPr>
-          <w:ilvl w:val="0"/>
-          <w:numId w:val="3"/>
-        </w:numPr>
-        <w:spacing w:after="80"/>
-      </w:pPr>
-      <w:r>
-        <w:rPr>
-          <w:rFonts w:ascii="Calibri" w:cs="Calibri" w:eastAsia="Calibri" w:hAnsi="Calibri"/>
-          <w:sz w:val="22"/>
-          <w:szCs w:val="22"/>
-        </w:rPr>
-        <w:t xml:space="preserve">Ako pita želite li Postgres, Redis ili Tigris: odgovorite No. Aplikacija ima vlastitu bazu na disku.</w:t>
-      </w:r>
-    </w:p>
-    <w:p>
-      <w:pPr>
-        <w:pStyle w:val="ListParagraph"/>
-        <w:numPr>
-          <w:ilvl w:val="0"/>
-          <w:numId w:val="3"/>
-        </w:numPr>
-        <w:spacing w:after="80"/>
-      </w:pPr>
-      <w:r>
-        <w:rPr>
-          <w:rFonts w:ascii="Calibri" w:cs="Calibri" w:eastAsia="Calibri" w:hAnsi="Calibri"/>
-          <w:sz w:val="22"/>
-          <w:szCs w:val="22"/>
-        </w:rPr>
-        <w:t xml:space="preserve">Ako pita „Do you want to tweak these settings before proceeding?”: odgovorite N.</w:t>
-      </w:r>
-    </w:p>
-    <w:p>
-      <w:pPr>
-        <w:pStyle w:val="ListParagraph"/>
-        <w:numPr>
-          <w:ilvl w:val="0"/>
-          <w:numId w:val="2"/>
-        </w:numPr>
-        <w:spacing w:after="100"/>
-      </w:pPr>
-      <w:r>
-        <w:rPr>
-          <w:rFonts w:ascii="Calibri" w:cs="Calibri" w:eastAsia="Calibri" w:hAnsi="Calibri"/>
-          <w:b w:val="false"/>
-          <w:bCs w:val="false"/>
-          <w:sz w:val="22"/>
-          <w:szCs w:val="22"/>
-        </w:rPr>
-        <w:t xml:space="preserve">Postavite pozivni kod. To je lozinka koju dajete samo ukućanima da bi mogli otvoriti račun; nitko drugi ne može. Izmislite kod bez razmaka, npr. obitelj-2026:</w:t>
-      </w:r>
-    </w:p>
-    <w:p>
-      <w:pPr>
-        <w:shd w:fill="F2F2F2" w:color="auto" w:val="clear"/>
-        <w:spacing w:after="120"/>
-        <w:ind w:left="360"/>
-      </w:pPr>
-      <w:r>
-        <w:rPr>
-          <w:rFonts w:ascii="Consolas" w:cs="Consolas" w:eastAsia="Consolas" w:hAnsi="Consolas"/>
-          <w:sz w:val="20"/>
-          <w:szCs w:val="20"/>
-        </w:rPr>
-        <w:t xml:space="preserve">fly secrets set INVITE_CODE=obitelj-2026</w:t>
-      </w:r>
-    </w:p>
-    <w:p>
-      <w:pPr>
-        <w:pStyle w:val="ListParagraph"/>
-        <w:numPr>
-          <w:ilvl w:val="0"/>
-          <w:numId w:val="2"/>
-        </w:numPr>
-        <w:spacing w:after="100"/>
-      </w:pPr>
-      <w:r>
-        <w:rPr>
-          <w:rFonts w:ascii="Calibri" w:cs="Calibri" w:eastAsia="Calibri" w:hAnsi="Calibri"/>
-          <w:b w:val="false"/>
-          <w:bCs w:val="false"/>
-          <w:sz w:val="22"/>
-          <w:szCs w:val="22"/>
-        </w:rPr>
-        <w:t xml:space="preserve">Objavite aplikaciju. Ovaj korak gradi aplikaciju u oblaku i traje 5 do 10 minuta; nemojte zatvarati prozor:</w:t>
-      </w:r>
-    </w:p>
-    <w:p>
-      <w:pPr>
-        <w:shd w:fill="F2F2F2" w:color="auto" w:val="clear"/>
-        <w:spacing w:after="120"/>
-        <w:ind w:left="360"/>
-      </w:pPr>
-      <w:r>
-        <w:rPr>
-          <w:rFonts w:ascii="Consolas" w:cs="Consolas" w:eastAsia="Consolas" w:hAnsi="Consolas"/>
-          <w:sz w:val="20"/>
-          <w:szCs w:val="20"/>
-        </w:rPr>
-        <w:t xml:space="preserve">fly deploy</w:t>
+        <w:t xml:space="preserve">2.3. Pokrenite objavu</w:t>
+      </w:r>
+    </w:p>
+    <w:p>
+      <w:pPr>
+        <w:pStyle w:val="ListParagraph"/>
+        <w:numPr>
+          <w:ilvl w:val="0"/>
+          <w:numId w:val="2"/>
+        </w:numPr>
+        <w:spacing w:after="100"/>
+      </w:pPr>
+      <w:r>
+        <w:rPr>
+          <w:rFonts w:ascii="Calibri" w:cs="Calibri" w:eastAsia="Calibri" w:hAnsi="Calibri"/>
+          <w:b w:val="false"/>
+          <w:bCs w:val="false"/>
+          <w:sz w:val="22"/>
+          <w:szCs w:val="22"/>
+        </w:rPr>
+        <w:t xml:space="preserve">U repozitoriju kliknite karticu Actions.</w:t>
+      </w:r>
+    </w:p>
+    <w:p>
+      <w:pPr>
+        <w:pStyle w:val="ListParagraph"/>
+        <w:numPr>
+          <w:ilvl w:val="0"/>
+          <w:numId w:val="2"/>
+        </w:numPr>
+        <w:spacing w:after="100"/>
+      </w:pPr>
+      <w:r>
+        <w:rPr>
+          <w:rFonts w:ascii="Calibri" w:cs="Calibri" w:eastAsia="Calibri" w:hAnsi="Calibri"/>
+          <w:b w:val="false"/>
+          <w:bCs w:val="false"/>
+          <w:sz w:val="22"/>
+          <w:szCs w:val="22"/>
+        </w:rPr>
+        <w:t xml:space="preserve">U lijevom popisu odaberite „Objavi na Fly.io”.</w:t>
+      </w:r>
+    </w:p>
+    <w:p>
+      <w:pPr>
+        <w:pStyle w:val="ListParagraph"/>
+        <w:numPr>
+          <w:ilvl w:val="0"/>
+          <w:numId w:val="2"/>
+        </w:numPr>
+        <w:spacing w:after="100"/>
+      </w:pPr>
+      <w:r>
+        <w:rPr>
+          <w:rFonts w:ascii="Calibri" w:cs="Calibri" w:eastAsia="Calibri" w:hAnsi="Calibri"/>
+          <w:b w:val="false"/>
+          <w:bCs w:val="false"/>
+          <w:sz w:val="22"/>
+          <w:szCs w:val="22"/>
+        </w:rPr>
+        <w:t xml:space="preserve">Desno kliknite Run workflow. U padajućem izborniku Use workflow from odaberite granu claude/online-storage-multi-device-qgm6qu (dok se ne spoji u main).</w:t>
+      </w:r>
+    </w:p>
+    <w:p>
+      <w:pPr>
+        <w:pStyle w:val="ListParagraph"/>
+        <w:numPr>
+          <w:ilvl w:val="0"/>
+          <w:numId w:val="2"/>
+        </w:numPr>
+        <w:spacing w:after="100"/>
+      </w:pPr>
+      <w:r>
+        <w:rPr>
+          <w:rFonts w:ascii="Calibri" w:cs="Calibri" w:eastAsia="Calibri" w:hAnsi="Calibri"/>
+          <w:b w:val="false"/>
+          <w:bCs w:val="false"/>
+          <w:sz w:val="22"/>
+          <w:szCs w:val="22"/>
+        </w:rPr>
+        <w:t xml:space="preserve">U polje app_name upišite isti naziv kao u FLY_APP_NAME (npr. tlak-prezime). Regiju ostavite fra (Frankfurt). Kliknite zeleni Run workflow.</w:t>
+      </w:r>
+    </w:p>
+    <w:p>
+      <w:pPr>
+        <w:pStyle w:val="ListParagraph"/>
+        <w:numPr>
+          <w:ilvl w:val="0"/>
+          <w:numId w:val="2"/>
+        </w:numPr>
+        <w:spacing w:after="100"/>
+      </w:pPr>
+      <w:r>
+        <w:rPr>
+          <w:rFonts w:ascii="Calibri" w:cs="Calibri" w:eastAsia="Calibri" w:hAnsi="Calibri"/>
+          <w:b w:val="false"/>
+          <w:bCs w:val="false"/>
+          <w:sz w:val="22"/>
+          <w:szCs w:val="22"/>
+        </w:rPr>
+        <w:t xml:space="preserve">Pojavit će se redak s žutim kružićem. Kliknite ga da vidite tijek. Kad svi koraci dobiju zelenu kvačicu (5 do 10 minuta), gotovo je. Zadnji korak ispisuje adresu.</w:t>
       </w:r>
     </w:p>
     <w:p>
@@ -924,55 +775,136 @@
           <w:sz w:val="21"/>
           <w:szCs w:val="21"/>
         </w:rPr>
-        <w:t xml:space="preserve">Ako na kraju piše da nedostaje volume (disk), pokrenite: fly volumes create tlak_data --size 1 --region fra, pa ponovno fly deploy.</w:t>
-      </w:r>
-    </w:p>
-    <w:p>
-      <w:pPr>
-        <w:pStyle w:val="ListParagraph"/>
-        <w:numPr>
-          <w:ilvl w:val="0"/>
-          <w:numId w:val="2"/>
-        </w:numPr>
-        <w:spacing w:after="100"/>
-      </w:pPr>
-      <w:r>
-        <w:rPr>
-          <w:rFonts w:ascii="Calibri" w:cs="Calibri" w:eastAsia="Calibri" w:hAnsi="Calibri"/>
-          <w:b w:val="false"/>
-          <w:bCs w:val="false"/>
-          <w:sz w:val="22"/>
-          <w:szCs w:val="22"/>
-        </w:rPr>
-        <w:t xml:space="preserve">Otvorite aplikaciju:</w:t>
-      </w:r>
-    </w:p>
-    <w:p>
-      <w:pPr>
-        <w:shd w:fill="F2F2F2" w:color="auto" w:val="clear"/>
+        <w:t xml:space="preserve">Ako korak „Stvori aplikaciju” padne s porukom da je naziv zauzet, izaberite drugi naziv, promijenite FLY_APP_NAME i ponovite Run workflow.</w:t>
+      </w:r>
+    </w:p>
+    <w:p>
+      <w:pPr>
+        <w:pStyle w:val="ListParagraph"/>
+        <w:numPr>
+          <w:ilvl w:val="0"/>
+          <w:numId w:val="2"/>
+        </w:numPr>
+        <w:spacing w:after="100"/>
+      </w:pPr>
+      <w:r>
+        <w:rPr>
+          <w:rFonts w:ascii="Calibri" w:cs="Calibri" w:eastAsia="Calibri" w:hAnsi="Calibri"/>
+          <w:b w:val="false"/>
+          <w:bCs w:val="false"/>
+          <w:sz w:val="22"/>
+          <w:szCs w:val="22"/>
+        </w:rPr>
+        <w:t xml:space="preserve">Otvorite https://vaš-naziv.fly.dev u pregledniku. Ako vidite početnu stranicu Tlaka, uspjeli ste. Nastavite s poglavljem 4.</w:t>
+      </w:r>
+    </w:p>
+    <w:p>
+      <w:pPr>
+        <w:pStyle w:val="Heading2"/>
+        <w:spacing w:after="100" w:before="240"/>
+      </w:pPr>
+      <w:r>
+        <w:rPr>
+          <w:rFonts w:ascii="Calibri" w:cs="Calibri" w:eastAsia="Calibri" w:hAnsi="Calibri"/>
+        </w:rPr>
+        <w:t xml:space="preserve">2.4. Što radi taj automat, jednostavno</w:t>
+      </w:r>
+    </w:p>
+    <w:p>
+      <w:pPr>
+        <w:pStyle w:val="ListParagraph"/>
+        <w:numPr>
+          <w:ilvl w:val="0"/>
+          <w:numId w:val="3"/>
+        </w:numPr>
+        <w:spacing w:after="80"/>
+      </w:pPr>
+      <w:r>
+        <w:rPr>
+          <w:rFonts w:ascii="Calibri" w:cs="Calibri" w:eastAsia="Calibri" w:hAnsi="Calibri"/>
+          <w:sz w:val="22"/>
+          <w:szCs w:val="22"/>
+        </w:rPr>
+        <w:t xml:space="preserve">Uzme kod aplikacije s GitHuba.</w:t>
+      </w:r>
+    </w:p>
+    <w:p>
+      <w:pPr>
+        <w:pStyle w:val="ListParagraph"/>
+        <w:numPr>
+          <w:ilvl w:val="0"/>
+          <w:numId w:val="3"/>
+        </w:numPr>
+        <w:spacing w:after="80"/>
+      </w:pPr>
+      <w:r>
+        <w:rPr>
+          <w:rFonts w:ascii="Calibri" w:cs="Calibri" w:eastAsia="Calibri" w:hAnsi="Calibri"/>
+          <w:sz w:val="22"/>
+          <w:szCs w:val="22"/>
+        </w:rPr>
+        <w:t xml:space="preserve">Na Fly.io stvori vašu aplikaciju i disk od 1 GB za bazu, ako već ne postoje.</w:t>
+      </w:r>
+    </w:p>
+    <w:p>
+      <w:pPr>
+        <w:pStyle w:val="ListParagraph"/>
+        <w:numPr>
+          <w:ilvl w:val="0"/>
+          <w:numId w:val="3"/>
+        </w:numPr>
+        <w:spacing w:after="80"/>
+      </w:pPr>
+      <w:r>
+        <w:rPr>
+          <w:rFonts w:ascii="Calibri" w:cs="Calibri" w:eastAsia="Calibri" w:hAnsi="Calibri"/>
+          <w:sz w:val="22"/>
+          <w:szCs w:val="22"/>
+        </w:rPr>
+        <w:t xml:space="preserve">Upiše pozivni kod kao tajnu na poslužitelj.</w:t>
+      </w:r>
+    </w:p>
+    <w:p>
+      <w:pPr>
+        <w:pStyle w:val="ListParagraph"/>
+        <w:numPr>
+          <w:ilvl w:val="0"/>
+          <w:numId w:val="3"/>
+        </w:numPr>
+        <w:spacing w:after="80"/>
+      </w:pPr>
+      <w:r>
+        <w:rPr>
+          <w:rFonts w:ascii="Calibri" w:cs="Calibri" w:eastAsia="Calibri" w:hAnsi="Calibri"/>
+          <w:sz w:val="22"/>
+          <w:szCs w:val="22"/>
+        </w:rPr>
+        <w:t xml:space="preserve">Zamoli Fly.io da izgradi aplikaciju i pokrene je. Vaše računalo u tome ne sudjeluje.</w:t>
+      </w:r>
+    </w:p>
+    <w:p>
+      <w:pPr>
+        <w:pStyle w:val="Heading2"/>
+        <w:spacing w:after="100" w:before="240"/>
+      </w:pPr>
+      <w:r>
+        <w:rPr>
+          <w:rFonts w:ascii="Calibri" w:cs="Calibri" w:eastAsia="Calibri" w:hAnsi="Calibri"/>
+        </w:rPr>
+        <w:t xml:space="preserve">2.5. Rezervni put: terminal u pregledniku (GitHub Codespaces)</w:t>
+      </w:r>
+    </w:p>
+    <w:p>
+      <w:pPr>
         <w:spacing w:after="120"/>
-        <w:ind w:left="360"/>
-      </w:pPr>
-      <w:r>
-        <w:rPr>
-          <w:rFonts w:ascii="Consolas" w:cs="Consolas" w:eastAsia="Consolas" w:hAnsi="Consolas"/>
-          <w:sz w:val="20"/>
-          <w:szCs w:val="20"/>
-        </w:rPr>
-        <w:t xml:space="preserve">fly open</w:t>
-      </w:r>
-    </w:p>
-    <w:p>
-      <w:pPr>
-        <w:spacing w:after="120"/>
-      </w:pPr>
-      <w:r>
-        <w:rPr>
-          <w:rFonts w:ascii="Calibri" w:cs="Calibri" w:eastAsia="Calibri" w:hAnsi="Calibri"/>
-          <w:sz w:val="22"/>
-          <w:szCs w:val="22"/>
-        </w:rPr>
-        <w:t xml:space="preserve">Preglednik otvara vašu adresu. Ako vidite početnu stranicu Tlaka, postavljanje je uspjelo.</w:t>
+      </w:pPr>
+      <w:r>
+        <w:rPr>
+          <w:rFonts w:ascii="Calibri" w:cs="Calibri" w:eastAsia="Calibri" w:hAnsi="Calibri"/>
+          <w:sz w:val="22"/>
+          <w:szCs w:val="22"/>
+        </w:rPr>
+        <w:t xml:space="preserve">Ako vam ikad zatreba naredba fly, a ne smijete ništa instalirati: u repozitoriju kliknite Code → Codespaces → Create codespace. Otvara se pravi terminal u pregledniku (besplatno 60 sati mjesečno). U njemu radi instalacija iz Puta B, jer je to računalo GitHuba, ne vaše.</w:t>
       </w:r>
     </w:p>
     <w:p>
@@ -984,107 +916,112 @@
         <w:rPr>
           <w:rFonts w:ascii="Calibri" w:cs="Calibri" w:eastAsia="Calibri" w:hAnsi="Calibri"/>
         </w:rPr>
-        <w:t xml:space="preserve">4. iPhone: instalacija i prijava</w:t>
-      </w:r>
-    </w:p>
-    <w:p>
-      <w:pPr>
-        <w:pStyle w:val="ListParagraph"/>
-        <w:numPr>
-          <w:ilvl w:val="0"/>
-          <w:numId w:val="2"/>
-        </w:numPr>
-        <w:spacing w:after="100"/>
-      </w:pPr>
-      <w:r>
-        <w:rPr>
-          <w:rFonts w:ascii="Calibri" w:cs="Calibri" w:eastAsia="Calibri" w:hAnsi="Calibri"/>
-          <w:b w:val="false"/>
-          <w:bCs w:val="false"/>
-          <w:sz w:val="22"/>
-          <w:szCs w:val="22"/>
-        </w:rPr>
-        <w:t xml:space="preserve">U Safariju otvorite https://vaš-naziv.fly.dev.</w:t>
-      </w:r>
-    </w:p>
-    <w:p>
-      <w:pPr>
-        <w:pStyle w:val="ListParagraph"/>
-        <w:numPr>
-          <w:ilvl w:val="0"/>
-          <w:numId w:val="2"/>
-        </w:numPr>
-        <w:spacing w:after="100"/>
-      </w:pPr>
-      <w:r>
-        <w:rPr>
-          <w:rFonts w:ascii="Calibri" w:cs="Calibri" w:eastAsia="Calibri" w:hAnsi="Calibri"/>
-          <w:b w:val="false"/>
-          <w:bCs w:val="false"/>
-          <w:sz w:val="22"/>
-          <w:szCs w:val="22"/>
-        </w:rPr>
-        <w:t xml:space="preserve">Pritisnite gumb Dijeli (kvadrat sa strelicom), zatim „Dodaj na početni zaslon”, pa Dodaj.</w:t>
-      </w:r>
-    </w:p>
-    <w:p>
-      <w:pPr>
-        <w:pStyle w:val="ListParagraph"/>
-        <w:numPr>
-          <w:ilvl w:val="0"/>
-          <w:numId w:val="2"/>
-        </w:numPr>
-        <w:spacing w:after="100"/>
-      </w:pPr>
-      <w:r>
-        <w:rPr>
-          <w:rFonts w:ascii="Calibri" w:cs="Calibri" w:eastAsia="Calibri" w:hAnsi="Calibri"/>
-          <w:b w:val="false"/>
-          <w:bCs w:val="false"/>
-          <w:sz w:val="22"/>
-          <w:szCs w:val="22"/>
-        </w:rPr>
-        <w:t xml:space="preserve">Otvorite ikonu Tlak s početnog zaslona. Idite u Postavke → Račun i sinkronizacija → Novi račun.</w:t>
-      </w:r>
-    </w:p>
-    <w:p>
-      <w:pPr>
-        <w:pStyle w:val="ListParagraph"/>
-        <w:numPr>
-          <w:ilvl w:val="0"/>
-          <w:numId w:val="2"/>
-        </w:numPr>
-        <w:spacing w:after="100"/>
-      </w:pPr>
-      <w:r>
-        <w:rPr>
-          <w:rFonts w:ascii="Calibri" w:cs="Calibri" w:eastAsia="Calibri" w:hAnsi="Calibri"/>
-          <w:b w:val="false"/>
-          <w:bCs w:val="false"/>
-          <w:sz w:val="22"/>
-          <w:szCs w:val="22"/>
-        </w:rPr>
-        <w:t xml:space="preserve">Unesite e-poštu, lozinku od najmanje 8 znakova i pozivni kod. Pritisnite „Stvori račun i sinkroniziraj”.</w:t>
-      </w:r>
-    </w:p>
-    <w:p>
-      <w:pPr>
-        <w:pStyle w:val="ListParagraph"/>
-        <w:numPr>
-          <w:ilvl w:val="0"/>
-          <w:numId w:val="2"/>
-        </w:numPr>
-        <w:spacing w:after="100"/>
-      </w:pPr>
-      <w:r>
-        <w:rPr>
-          <w:rFonts w:ascii="Calibri" w:cs="Calibri" w:eastAsia="Calibri" w:hAnsi="Calibri"/>
-          <w:b w:val="false"/>
-          <w:bCs w:val="false"/>
-          <w:sz w:val="22"/>
-          <w:szCs w:val="22"/>
-        </w:rPr>
-        <w:t xml:space="preserve">Na drugom uređaju (Mac, iPad, Windows) otvorite istu adresu i odaberite Prijava s istim podacima. Mjerenja se pojavljuju u nekoliko sekundi.</w:t>
+        <w:t xml:space="preserve">3. Put B: s naredbom fly na vlastitom računalu (traži instalaciju)</w:t>
+      </w:r>
+    </w:p>
+    <w:p>
+      <w:pPr>
+        <w:spacing w:after="120"/>
+      </w:pPr>
+      <w:r>
+        <w:rPr>
+          <w:rFonts w:ascii="Calibri" w:cs="Calibri" w:eastAsia="Calibri" w:hAnsi="Calibri"/>
+          <w:sz w:val="22"/>
+          <w:szCs w:val="22"/>
+        </w:rPr>
+        <w:t xml:space="preserve">Ovaj put koristite samo ako smijete instalirati programe. Na Windowsu bez administratorskih prava preskočite ga i držite se Puta A.</w:t>
+      </w:r>
+    </w:p>
+    <w:p>
+      <w:pPr>
+        <w:pStyle w:val="Heading2"/>
+        <w:spacing w:after="100" w:before="240"/>
+      </w:pPr>
+      <w:r>
+        <w:rPr>
+          <w:rFonts w:ascii="Calibri" w:cs="Calibri" w:eastAsia="Calibri" w:hAnsi="Calibri"/>
+        </w:rPr>
+        <w:t xml:space="preserve">3.1. Preuzmite aplikaciju s GitHuba</w:t>
+      </w:r>
+    </w:p>
+    <w:p>
+      <w:pPr>
+        <w:pStyle w:val="ListParagraph"/>
+        <w:numPr>
+          <w:ilvl w:val="0"/>
+          <w:numId w:val="2"/>
+        </w:numPr>
+        <w:spacing w:after="100"/>
+      </w:pPr>
+      <w:r>
+        <w:rPr>
+          <w:rFonts w:ascii="Calibri" w:cs="Calibri" w:eastAsia="Calibri" w:hAnsi="Calibri"/>
+          <w:b w:val="false"/>
+          <w:bCs w:val="false"/>
+          <w:sz w:val="22"/>
+          <w:szCs w:val="22"/>
+        </w:rPr>
+        <w:t xml:space="preserve">Prijavite se na github.com i otvorite repozitorij ldanijel/tlak.</w:t>
+      </w:r>
+    </w:p>
+    <w:p>
+      <w:pPr>
+        <w:pStyle w:val="ListParagraph"/>
+        <w:numPr>
+          <w:ilvl w:val="0"/>
+          <w:numId w:val="2"/>
+        </w:numPr>
+        <w:spacing w:after="100"/>
+      </w:pPr>
+      <w:r>
+        <w:rPr>
+          <w:rFonts w:ascii="Calibri" w:cs="Calibri" w:eastAsia="Calibri" w:hAnsi="Calibri"/>
+          <w:b w:val="false"/>
+          <w:bCs w:val="false"/>
+          <w:sz w:val="22"/>
+          <w:szCs w:val="22"/>
+        </w:rPr>
+        <w:t xml:space="preserve">Iznad popisa datoteka odaberite granu claude/online-storage-multi-device-qgm6qu (padajući izbornik s nazivom grane).</w:t>
+      </w:r>
+    </w:p>
+    <w:p>
+      <w:pPr>
+        <w:pStyle w:val="ListParagraph"/>
+        <w:numPr>
+          <w:ilvl w:val="0"/>
+          <w:numId w:val="2"/>
+        </w:numPr>
+        <w:spacing w:after="100"/>
+      </w:pPr>
+      <w:r>
+        <w:rPr>
+          <w:rFonts w:ascii="Calibri" w:cs="Calibri" w:eastAsia="Calibri" w:hAnsi="Calibri"/>
+          <w:b w:val="false"/>
+          <w:bCs w:val="false"/>
+          <w:sz w:val="22"/>
+          <w:szCs w:val="22"/>
+        </w:rPr>
+        <w:t xml:space="preserve">Kliknite zeleni gumb Code, zatim Download ZIP.</w:t>
+      </w:r>
+    </w:p>
+    <w:p>
+      <w:pPr>
+        <w:pStyle w:val="ListParagraph"/>
+        <w:numPr>
+          <w:ilvl w:val="0"/>
+          <w:numId w:val="2"/>
+        </w:numPr>
+        <w:spacing w:after="100"/>
+      </w:pPr>
+      <w:r>
+        <w:rPr>
+          <w:rFonts w:ascii="Calibri" w:cs="Calibri" w:eastAsia="Calibri" w:hAnsi="Calibri"/>
+          <w:b w:val="false"/>
+          <w:bCs w:val="false"/>
+          <w:sz w:val="22"/>
+          <w:szCs w:val="22"/>
+        </w:rPr>
+        <w:t xml:space="preserve">Raspakirajte ZIP. Dobit ćete mapu, npr. tlak-claude-online-storage-multi-device-qgm6qu. Preimenujte je u tlak i stavite u Dokumente.</w:t>
       </w:r>
     </w:p>
     <w:p>
@@ -1103,7 +1040,460 @@
           <w:sz w:val="21"/>
           <w:szCs w:val="21"/>
         </w:rPr>
-        <w:t xml:space="preserve">Prvo otvaranje nakon dužeg mirovanja može trajati 2 do 3 sekunde jer se računalo u oblaku budi. Unos i pregled rade i bez interneta; sinkronizacija se obavi kad se veza vrati.</w:t>
+        <w:t xml:space="preserve">Kad kasnije spojimo granu u glavnu (main), preuzimat ćete ZIP s glavne grane, bez biranja grane.</w:t>
+      </w:r>
+    </w:p>
+    <w:p>
+      <w:pPr>
+        <w:pStyle w:val="Heading2"/>
+        <w:spacing w:after="100" w:before="240"/>
+      </w:pPr>
+      <w:r>
+        <w:rPr>
+          <w:rFonts w:ascii="Calibri" w:cs="Calibri" w:eastAsia="Calibri" w:hAnsi="Calibri"/>
+        </w:rPr>
+        <w:t xml:space="preserve">3.2. Instalirajte alat flyctl</w:t>
+      </w:r>
+    </w:p>
+    <w:p>
+      <w:pPr>
+        <w:spacing w:after="120"/>
+      </w:pPr>
+      <w:r>
+        <w:rPr>
+          <w:rFonts w:ascii="Calibri" w:cs="Calibri" w:eastAsia="Calibri" w:hAnsi="Calibri"/>
+          <w:sz w:val="22"/>
+          <w:szCs w:val="22"/>
+        </w:rPr>
+        <w:t xml:space="preserve">Flyctl je mali program kojim se naredbama upravlja računalom u oblaku. Otvorite Terminal (Mac: Aplikacije → Uslužni programi → Terminal) ili PowerShell (Windows: tipka Windows, upišite PowerShell, Enter). Zalijepite naredbu i pritisnite Enter.</w:t>
+      </w:r>
+    </w:p>
+    <w:p>
+      <w:pPr>
+        <w:spacing w:after="120"/>
+      </w:pPr>
+      <w:r>
+        <w:rPr>
+          <w:rFonts w:ascii="Calibri" w:cs="Calibri" w:eastAsia="Calibri" w:hAnsi="Calibri"/>
+          <w:b/>
+          <w:bCs/>
+          <w:sz w:val="22"/>
+          <w:szCs w:val="22"/>
+        </w:rPr>
+        <w:t xml:space="preserve">Mac:</w:t>
+      </w:r>
+    </w:p>
+    <w:p>
+      <w:pPr>
+        <w:shd w:fill="F2F2F2" w:color="auto" w:val="clear"/>
+        <w:spacing w:after="120"/>
+        <w:ind w:left="360"/>
+      </w:pPr>
+      <w:r>
+        <w:rPr>
+          <w:rFonts w:ascii="Consolas" w:cs="Consolas" w:eastAsia="Consolas" w:hAnsi="Consolas"/>
+          <w:sz w:val="20"/>
+          <w:szCs w:val="20"/>
+        </w:rPr>
+        <w:t xml:space="preserve">curl -L https://fly.io/install.sh | sh</w:t>
+      </w:r>
+    </w:p>
+    <w:p>
+      <w:pPr>
+        <w:spacing w:after="120"/>
+      </w:pPr>
+      <w:r>
+        <w:rPr>
+          <w:rFonts w:ascii="Calibri" w:cs="Calibri" w:eastAsia="Calibri" w:hAnsi="Calibri"/>
+          <w:sz w:val="22"/>
+          <w:szCs w:val="22"/>
+        </w:rPr>
+        <w:t xml:space="preserve">Nakon instalacije zatvorite Terminal i otvorite ga ponovno da bi naredba fly postala dostupna.</w:t>
+      </w:r>
+    </w:p>
+    <w:p>
+      <w:pPr>
+        <w:spacing w:after="120"/>
+      </w:pPr>
+      <w:r>
+        <w:rPr>
+          <w:rFonts w:ascii="Calibri" w:cs="Calibri" w:eastAsia="Calibri" w:hAnsi="Calibri"/>
+          <w:b/>
+          <w:bCs/>
+          <w:sz w:val="22"/>
+          <w:szCs w:val="22"/>
+        </w:rPr>
+        <w:t xml:space="preserve">Windows (PowerShell):</w:t>
+      </w:r>
+    </w:p>
+    <w:p>
+      <w:pPr>
+        <w:shd w:fill="F2F2F2" w:color="auto" w:val="clear"/>
+        <w:spacing w:after="120"/>
+        <w:ind w:left="360"/>
+      </w:pPr>
+      <w:r>
+        <w:rPr>
+          <w:rFonts w:ascii="Consolas" w:cs="Consolas" w:eastAsia="Consolas" w:hAnsi="Consolas"/>
+          <w:sz w:val="20"/>
+          <w:szCs w:val="20"/>
+        </w:rPr>
+        <w:t xml:space="preserve">pwsh -Command "iwr https://fly.io/install.ps1 -useb | iex"</w:t>
+      </w:r>
+    </w:p>
+    <w:p>
+      <w:pPr>
+        <w:spacing w:after="120"/>
+      </w:pPr>
+      <w:r>
+        <w:rPr>
+          <w:rFonts w:ascii="Calibri" w:cs="Calibri" w:eastAsia="Calibri" w:hAnsi="Calibri"/>
+          <w:sz w:val="22"/>
+          <w:szCs w:val="22"/>
+        </w:rPr>
+        <w:t xml:space="preserve">Ako Windows javi da pwsh ne postoji, zalijepite samo dio unutar navodnika: iwr https://fly.io/install.ps1 -useb | iex. Nakon toga zatvorite i ponovno otvorite PowerShell.</w:t>
+      </w:r>
+    </w:p>
+    <w:p>
+      <w:pPr>
+        <w:spacing w:after="120"/>
+      </w:pPr>
+      <w:r>
+        <w:rPr>
+          <w:rFonts w:ascii="Calibri" w:cs="Calibri" w:eastAsia="Calibri" w:hAnsi="Calibri"/>
+          <w:sz w:val="22"/>
+          <w:szCs w:val="22"/>
+        </w:rPr>
+        <w:t xml:space="preserve">Provjera: upišite fly version. Ako se ispiše broj verzije, spremni ste.</w:t>
+      </w:r>
+    </w:p>
+    <w:p>
+      <w:pPr>
+        <w:pStyle w:val="Heading2"/>
+        <w:spacing w:after="100" w:before="240"/>
+      </w:pPr>
+      <w:r>
+        <w:rPr>
+          <w:rFonts w:ascii="Calibri" w:cs="Calibri" w:eastAsia="Calibri" w:hAnsi="Calibri"/>
+        </w:rPr>
+        <w:t xml:space="preserve">3.3. Otvorite račun na Fly.io</w:t>
+      </w:r>
+    </w:p>
+    <w:p>
+      <w:pPr>
+        <w:shd w:fill="F2F2F2" w:color="auto" w:val="clear"/>
+        <w:spacing w:after="120"/>
+        <w:ind w:left="360"/>
+      </w:pPr>
+      <w:r>
+        <w:rPr>
+          <w:rFonts w:ascii="Consolas" w:cs="Consolas" w:eastAsia="Consolas" w:hAnsi="Consolas"/>
+          <w:sz w:val="20"/>
+          <w:szCs w:val="20"/>
+        </w:rPr>
+        <w:t xml:space="preserve">fly auth signup</w:t>
+      </w:r>
+    </w:p>
+    <w:p>
+      <w:pPr>
+        <w:spacing w:after="120"/>
+      </w:pPr>
+      <w:r>
+        <w:rPr>
+          <w:rFonts w:ascii="Calibri" w:cs="Calibri" w:eastAsia="Calibri" w:hAnsi="Calibri"/>
+          <w:sz w:val="22"/>
+          <w:szCs w:val="22"/>
+        </w:rPr>
+        <w:t xml:space="preserve">Otvorit će se preglednik. Registrirajte se e-poštom ili GitHub računom i unesite platnu karticu (Fly.io je traži i za male iznose). Vratite se u Terminal; ispisat će „successfully logged in”.</w:t>
+      </w:r>
+    </w:p>
+    <w:p>
+      <w:pPr>
+        <w:pStyle w:val="Heading2"/>
+        <w:spacing w:after="100" w:before="240"/>
+      </w:pPr>
+      <w:r>
+        <w:rPr>
+          <w:rFonts w:ascii="Calibri" w:cs="Calibri" w:eastAsia="Calibri" w:hAnsi="Calibri"/>
+        </w:rPr>
+        <w:t xml:space="preserve">3.4. Prvo postavljanje naredbama</w:t>
+      </w:r>
+    </w:p>
+    <w:p>
+      <w:pPr>
+        <w:pStyle w:val="ListParagraph"/>
+        <w:numPr>
+          <w:ilvl w:val="0"/>
+          <w:numId w:val="2"/>
+        </w:numPr>
+        <w:spacing w:after="100"/>
+      </w:pPr>
+      <w:r>
+        <w:rPr>
+          <w:rFonts w:ascii="Calibri" w:cs="Calibri" w:eastAsia="Calibri" w:hAnsi="Calibri"/>
+          <w:b w:val="false"/>
+          <w:bCs w:val="false"/>
+          <w:sz w:val="22"/>
+          <w:szCs w:val="22"/>
+        </w:rPr>
+        <w:t xml:space="preserve">U Terminalu uđite u mapu aplikacije. Mac: cd ~/Documents/tlak. Windows: cd $HOME\Documents\tlak.</w:t>
+      </w:r>
+    </w:p>
+    <w:p>
+      <w:pPr>
+        <w:pStyle w:val="ListParagraph"/>
+        <w:numPr>
+          <w:ilvl w:val="0"/>
+          <w:numId w:val="2"/>
+        </w:numPr>
+        <w:spacing w:after="100"/>
+      </w:pPr>
+      <w:r>
+        <w:rPr>
+          <w:rFonts w:ascii="Calibri" w:cs="Calibri" w:eastAsia="Calibri" w:hAnsi="Calibri"/>
+          <w:b w:val="false"/>
+          <w:bCs w:val="false"/>
+          <w:sz w:val="22"/>
+          <w:szCs w:val="22"/>
+        </w:rPr>
+        <w:t xml:space="preserve">Pokrenite:</w:t>
+      </w:r>
+    </w:p>
+    <w:p>
+      <w:pPr>
+        <w:shd w:fill="F2F2F2" w:color="auto" w:val="clear"/>
+        <w:spacing w:after="120"/>
+        <w:ind w:left="360"/>
+      </w:pPr>
+      <w:r>
+        <w:rPr>
+          <w:rFonts w:ascii="Consolas" w:cs="Consolas" w:eastAsia="Consolas" w:hAnsi="Consolas"/>
+          <w:sz w:val="20"/>
+          <w:szCs w:val="20"/>
+        </w:rPr>
+        <w:t xml:space="preserve">fly launch --copy-config --no-deploy</w:t>
+      </w:r>
+    </w:p>
+    <w:p>
+      <w:pPr>
+        <w:spacing w:after="120"/>
+      </w:pPr>
+      <w:r>
+        <w:rPr>
+          <w:rFonts w:ascii="Calibri" w:cs="Calibri" w:eastAsia="Calibri" w:hAnsi="Calibri"/>
+          <w:sz w:val="22"/>
+          <w:szCs w:val="22"/>
+        </w:rPr>
+        <w:t xml:space="preserve">Odgovori na pitanja:</w:t>
+      </w:r>
+    </w:p>
+    <w:p>
+      <w:pPr>
+        <w:pStyle w:val="ListParagraph"/>
+        <w:numPr>
+          <w:ilvl w:val="0"/>
+          <w:numId w:val="3"/>
+        </w:numPr>
+        <w:spacing w:after="80"/>
+      </w:pPr>
+      <w:r>
+        <w:rPr>
+          <w:rFonts w:ascii="Calibri" w:cs="Calibri" w:eastAsia="Calibri" w:hAnsi="Calibri"/>
+          <w:sz w:val="22"/>
+          <w:szCs w:val="22"/>
+        </w:rPr>
+        <w:t xml:space="preserve">App name: upišite jedinstven naziv, npr. tlak-prezime (mala slova, brojke, crtice). Adresa će biti https://tlak-prezime.fly.dev.</w:t>
+      </w:r>
+    </w:p>
+    <w:p>
+      <w:pPr>
+        <w:pStyle w:val="ListParagraph"/>
+        <w:numPr>
+          <w:ilvl w:val="0"/>
+          <w:numId w:val="3"/>
+        </w:numPr>
+        <w:spacing w:after="80"/>
+      </w:pPr>
+      <w:r>
+        <w:rPr>
+          <w:rFonts w:ascii="Calibri" w:cs="Calibri" w:eastAsia="Calibri" w:hAnsi="Calibri"/>
+          <w:sz w:val="22"/>
+          <w:szCs w:val="22"/>
+        </w:rPr>
+        <w:t xml:space="preserve">Region: odaberite Frankfurt (fra), najbliže Hrvatskoj.</w:t>
+      </w:r>
+    </w:p>
+    <w:p>
+      <w:pPr>
+        <w:pStyle w:val="ListParagraph"/>
+        <w:numPr>
+          <w:ilvl w:val="0"/>
+          <w:numId w:val="3"/>
+        </w:numPr>
+        <w:spacing w:after="80"/>
+      </w:pPr>
+      <w:r>
+        <w:rPr>
+          <w:rFonts w:ascii="Calibri" w:cs="Calibri" w:eastAsia="Calibri" w:hAnsi="Calibri"/>
+          <w:sz w:val="22"/>
+          <w:szCs w:val="22"/>
+        </w:rPr>
+        <w:t xml:space="preserve">Ako pita želite li Postgres, Redis ili Tigris: odgovorite No. Aplikacija ima vlastitu bazu na disku.</w:t>
+      </w:r>
+    </w:p>
+    <w:p>
+      <w:pPr>
+        <w:pStyle w:val="ListParagraph"/>
+        <w:numPr>
+          <w:ilvl w:val="0"/>
+          <w:numId w:val="3"/>
+        </w:numPr>
+        <w:spacing w:after="80"/>
+      </w:pPr>
+      <w:r>
+        <w:rPr>
+          <w:rFonts w:ascii="Calibri" w:cs="Calibri" w:eastAsia="Calibri" w:hAnsi="Calibri"/>
+          <w:sz w:val="22"/>
+          <w:szCs w:val="22"/>
+        </w:rPr>
+        <w:t xml:space="preserve">Ako pita „Do you want to tweak these settings before proceeding?”: odgovorite N.</w:t>
+      </w:r>
+    </w:p>
+    <w:p>
+      <w:pPr>
+        <w:pStyle w:val="ListParagraph"/>
+        <w:numPr>
+          <w:ilvl w:val="0"/>
+          <w:numId w:val="2"/>
+        </w:numPr>
+        <w:spacing w:after="100"/>
+      </w:pPr>
+      <w:r>
+        <w:rPr>
+          <w:rFonts w:ascii="Calibri" w:cs="Calibri" w:eastAsia="Calibri" w:hAnsi="Calibri"/>
+          <w:b w:val="false"/>
+          <w:bCs w:val="false"/>
+          <w:sz w:val="22"/>
+          <w:szCs w:val="22"/>
+        </w:rPr>
+        <w:t xml:space="preserve">Postavite pozivni kod. To je lozinka koju dajete samo ukućanima da bi mogli otvoriti račun; nitko drugi ne može. Izmislite kod bez razmaka, npr. obitelj-2026:</w:t>
+      </w:r>
+    </w:p>
+    <w:p>
+      <w:pPr>
+        <w:shd w:fill="F2F2F2" w:color="auto" w:val="clear"/>
+        <w:spacing w:after="120"/>
+        <w:ind w:left="360"/>
+      </w:pPr>
+      <w:r>
+        <w:rPr>
+          <w:rFonts w:ascii="Consolas" w:cs="Consolas" w:eastAsia="Consolas" w:hAnsi="Consolas"/>
+          <w:sz w:val="20"/>
+          <w:szCs w:val="20"/>
+        </w:rPr>
+        <w:t xml:space="preserve">fly secrets set INVITE_CODE=obitelj-2026</w:t>
+      </w:r>
+    </w:p>
+    <w:p>
+      <w:pPr>
+        <w:pStyle w:val="ListParagraph"/>
+        <w:numPr>
+          <w:ilvl w:val="0"/>
+          <w:numId w:val="2"/>
+        </w:numPr>
+        <w:spacing w:after="100"/>
+      </w:pPr>
+      <w:r>
+        <w:rPr>
+          <w:rFonts w:ascii="Calibri" w:cs="Calibri" w:eastAsia="Calibri" w:hAnsi="Calibri"/>
+          <w:b w:val="false"/>
+          <w:bCs w:val="false"/>
+          <w:sz w:val="22"/>
+          <w:szCs w:val="22"/>
+        </w:rPr>
+        <w:t xml:space="preserve">Objavite aplikaciju. Ovaj korak gradi aplikaciju u oblaku i traje 5 do 10 minuta; nemojte zatvarati prozor:</w:t>
+      </w:r>
+    </w:p>
+    <w:p>
+      <w:pPr>
+        <w:shd w:fill="F2F2F2" w:color="auto" w:val="clear"/>
+        <w:spacing w:after="120"/>
+        <w:ind w:left="360"/>
+      </w:pPr>
+      <w:r>
+        <w:rPr>
+          <w:rFonts w:ascii="Consolas" w:cs="Consolas" w:eastAsia="Consolas" w:hAnsi="Consolas"/>
+          <w:sz w:val="20"/>
+          <w:szCs w:val="20"/>
+        </w:rPr>
+        <w:t xml:space="preserve">fly deploy</w:t>
+      </w:r>
+    </w:p>
+    <w:p>
+      <w:pPr>
+        <w:pBdr>
+          <w:left w:val="single" w:color="2A78D6" w:sz="12" w:space="8"/>
+        </w:pBdr>
+        <w:spacing w:after="140"/>
+        <w:ind w:left="360"/>
+      </w:pPr>
+      <w:r>
+        <w:rPr>
+          <w:rFonts w:ascii="Calibri" w:cs="Calibri" w:eastAsia="Calibri" w:hAnsi="Calibri"/>
+          <w:i/>
+          <w:iCs/>
+          <w:sz w:val="21"/>
+          <w:szCs w:val="21"/>
+        </w:rPr>
+        <w:t xml:space="preserve">Ako na kraju piše da nedostaje volume (disk), pokrenite: fly volumes create tlak_data --size 1 --region fra, pa ponovno fly deploy.</w:t>
+      </w:r>
+    </w:p>
+    <w:p>
+      <w:pPr>
+        <w:pStyle w:val="ListParagraph"/>
+        <w:numPr>
+          <w:ilvl w:val="0"/>
+          <w:numId w:val="2"/>
+        </w:numPr>
+        <w:spacing w:after="100"/>
+      </w:pPr>
+      <w:r>
+        <w:rPr>
+          <w:rFonts w:ascii="Calibri" w:cs="Calibri" w:eastAsia="Calibri" w:hAnsi="Calibri"/>
+          <w:b w:val="false"/>
+          <w:bCs w:val="false"/>
+          <w:sz w:val="22"/>
+          <w:szCs w:val="22"/>
+        </w:rPr>
+        <w:t xml:space="preserve">Otvorite aplikaciju:</w:t>
+      </w:r>
+    </w:p>
+    <w:p>
+      <w:pPr>
+        <w:shd w:fill="F2F2F2" w:color="auto" w:val="clear"/>
+        <w:spacing w:after="120"/>
+        <w:ind w:left="360"/>
+      </w:pPr>
+      <w:r>
+        <w:rPr>
+          <w:rFonts w:ascii="Consolas" w:cs="Consolas" w:eastAsia="Consolas" w:hAnsi="Consolas"/>
+          <w:sz w:val="20"/>
+          <w:szCs w:val="20"/>
+        </w:rPr>
+        <w:t xml:space="preserve">fly open</w:t>
+      </w:r>
+    </w:p>
+    <w:p>
+      <w:pPr>
+        <w:spacing w:after="120"/>
+      </w:pPr>
+      <w:r>
+        <w:rPr>
+          <w:rFonts w:ascii="Calibri" w:cs="Calibri" w:eastAsia="Calibri" w:hAnsi="Calibri"/>
+          <w:sz w:val="22"/>
+          <w:szCs w:val="22"/>
+        </w:rPr>
+        <w:t xml:space="preserve">Preglednik otvara vašu adresu. Ako vidite početnu stranicu Tlaka, postavljanje je uspjelo.</w:t>
       </w:r>
     </w:p>
     <w:p>
@@ -1115,79 +1505,126 @@
         <w:rPr>
           <w:rFonts w:ascii="Calibri" w:cs="Calibri" w:eastAsia="Calibri" w:hAnsi="Calibri"/>
         </w:rPr>
-        <w:t xml:space="preserve">5. Ukućani</w:t>
-      </w:r>
-    </w:p>
-    <w:p>
-      <w:pPr>
-        <w:pStyle w:val="ListParagraph"/>
-        <w:numPr>
-          <w:ilvl w:val="0"/>
-          <w:numId w:val="3"/>
-        </w:numPr>
-        <w:spacing w:after="80"/>
-      </w:pPr>
-      <w:r>
-        <w:rPr>
-          <w:rFonts w:ascii="Calibri" w:cs="Calibri" w:eastAsia="Calibri" w:hAnsi="Calibri"/>
-          <w:sz w:val="22"/>
-          <w:szCs w:val="22"/>
-        </w:rPr>
-        <w:t xml:space="preserve">Svakoj osobi pošaljite adresu i pozivni kod. Svatko otvara svoj račun sa svojom e-poštom.</w:t>
-      </w:r>
-    </w:p>
-    <w:p>
-      <w:pPr>
-        <w:pStyle w:val="ListParagraph"/>
-        <w:numPr>
-          <w:ilvl w:val="0"/>
-          <w:numId w:val="3"/>
-        </w:numPr>
-        <w:spacing w:after="80"/>
-      </w:pPr>
-      <w:r>
-        <w:rPr>
-          <w:rFonts w:ascii="Calibri" w:cs="Calibri" w:eastAsia="Calibri" w:hAnsi="Calibri"/>
-          <w:sz w:val="22"/>
-          <w:szCs w:val="22"/>
-        </w:rPr>
-        <w:t xml:space="preserve">Podaci su razdvojeni po računima; nitko ne vidi tuđa mjerenja.</w:t>
-      </w:r>
-    </w:p>
-    <w:p>
-      <w:pPr>
-        <w:pStyle w:val="ListParagraph"/>
-        <w:numPr>
-          <w:ilvl w:val="0"/>
-          <w:numId w:val="3"/>
-        </w:numPr>
-        <w:spacing w:after="80"/>
-      </w:pPr>
-      <w:r>
-        <w:rPr>
-          <w:rFonts w:ascii="Calibri" w:cs="Calibri" w:eastAsia="Calibri" w:hAnsi="Calibri"/>
-          <w:sz w:val="22"/>
-          <w:szCs w:val="22"/>
-        </w:rPr>
-        <w:t xml:space="preserve">Ako netko izgubi lozinku, nova se lozinka ne može poslati e-poštom (aplikacija nema slanje e-pošte). Podaci se vraćaju iz JSON sigurnosne kopije u novi račun. Zato svakome preporučite povremenu kopiju iz Postavke → Sigurnosna kopija.</w:t>
-      </w:r>
-    </w:p>
-    <w:p>
-      <w:pPr>
-        <w:pStyle w:val="ListParagraph"/>
-        <w:numPr>
-          <w:ilvl w:val="0"/>
-          <w:numId w:val="3"/>
-        </w:numPr>
-        <w:spacing w:after="80"/>
-      </w:pPr>
-      <w:r>
-        <w:rPr>
-          <w:rFonts w:ascii="Calibri" w:cs="Calibri" w:eastAsia="Calibri" w:hAnsi="Calibri"/>
-          <w:sz w:val="22"/>
-          <w:szCs w:val="22"/>
-        </w:rPr>
-        <w:t xml:space="preserve">Želite li kasnije potpuno zatvoriti registraciju: fly secrets set ALLOW_REGISTRATION=false</w:t>
+        <w:t xml:space="preserve">4. iPhone: instalacija i prijava</w:t>
+      </w:r>
+    </w:p>
+    <w:p>
+      <w:pPr>
+        <w:pStyle w:val="ListParagraph"/>
+        <w:numPr>
+          <w:ilvl w:val="0"/>
+          <w:numId w:val="2"/>
+        </w:numPr>
+        <w:spacing w:after="100"/>
+      </w:pPr>
+      <w:r>
+        <w:rPr>
+          <w:rFonts w:ascii="Calibri" w:cs="Calibri" w:eastAsia="Calibri" w:hAnsi="Calibri"/>
+          <w:b w:val="false"/>
+          <w:bCs w:val="false"/>
+          <w:sz w:val="22"/>
+          <w:szCs w:val="22"/>
+        </w:rPr>
+        <w:t xml:space="preserve">U Safariju otvorite https://vaš-naziv.fly.dev.</w:t>
+      </w:r>
+    </w:p>
+    <w:p>
+      <w:pPr>
+        <w:pStyle w:val="ListParagraph"/>
+        <w:numPr>
+          <w:ilvl w:val="0"/>
+          <w:numId w:val="2"/>
+        </w:numPr>
+        <w:spacing w:after="100"/>
+      </w:pPr>
+      <w:r>
+        <w:rPr>
+          <w:rFonts w:ascii="Calibri" w:cs="Calibri" w:eastAsia="Calibri" w:hAnsi="Calibri"/>
+          <w:b w:val="false"/>
+          <w:bCs w:val="false"/>
+          <w:sz w:val="22"/>
+          <w:szCs w:val="22"/>
+        </w:rPr>
+        <w:t xml:space="preserve">Pritisnite gumb Dijeli (kvadrat sa strelicom), zatim „Dodaj na početni zaslon”, pa Dodaj.</w:t>
+      </w:r>
+    </w:p>
+    <w:p>
+      <w:pPr>
+        <w:pStyle w:val="ListParagraph"/>
+        <w:numPr>
+          <w:ilvl w:val="0"/>
+          <w:numId w:val="2"/>
+        </w:numPr>
+        <w:spacing w:after="100"/>
+      </w:pPr>
+      <w:r>
+        <w:rPr>
+          <w:rFonts w:ascii="Calibri" w:cs="Calibri" w:eastAsia="Calibri" w:hAnsi="Calibri"/>
+          <w:b w:val="false"/>
+          <w:bCs w:val="false"/>
+          <w:sz w:val="22"/>
+          <w:szCs w:val="22"/>
+        </w:rPr>
+        <w:t xml:space="preserve">Otvorite ikonu Tlak s početnog zaslona. Idite u Postavke → Račun i sinkronizacija → Novi račun.</w:t>
+      </w:r>
+    </w:p>
+    <w:p>
+      <w:pPr>
+        <w:pStyle w:val="ListParagraph"/>
+        <w:numPr>
+          <w:ilvl w:val="0"/>
+          <w:numId w:val="2"/>
+        </w:numPr>
+        <w:spacing w:after="100"/>
+      </w:pPr>
+      <w:r>
+        <w:rPr>
+          <w:rFonts w:ascii="Calibri" w:cs="Calibri" w:eastAsia="Calibri" w:hAnsi="Calibri"/>
+          <w:b w:val="false"/>
+          <w:bCs w:val="false"/>
+          <w:sz w:val="22"/>
+          <w:szCs w:val="22"/>
+        </w:rPr>
+        <w:t xml:space="preserve">Unesite e-poštu, lozinku od najmanje 8 znakova i pozivni kod. Pritisnite „Stvori račun i sinkroniziraj”.</w:t>
+      </w:r>
+    </w:p>
+    <w:p>
+      <w:pPr>
+        <w:pStyle w:val="ListParagraph"/>
+        <w:numPr>
+          <w:ilvl w:val="0"/>
+          <w:numId w:val="2"/>
+        </w:numPr>
+        <w:spacing w:after="100"/>
+      </w:pPr>
+      <w:r>
+        <w:rPr>
+          <w:rFonts w:ascii="Calibri" w:cs="Calibri" w:eastAsia="Calibri" w:hAnsi="Calibri"/>
+          <w:b w:val="false"/>
+          <w:bCs w:val="false"/>
+          <w:sz w:val="22"/>
+          <w:szCs w:val="22"/>
+        </w:rPr>
+        <w:t xml:space="preserve">Na drugom uređaju (Mac, iPad, Windows) otvorite istu adresu i odaberite Prijava s istim podacima. Mjerenja se pojavljuju u nekoliko sekundi.</w:t>
+      </w:r>
+    </w:p>
+    <w:p>
+      <w:pPr>
+        <w:pBdr>
+          <w:left w:val="single" w:color="2A78D6" w:sz="12" w:space="8"/>
+        </w:pBdr>
+        <w:spacing w:after="140"/>
+        <w:ind w:left="360"/>
+      </w:pPr>
+      <w:r>
+        <w:rPr>
+          <w:rFonts w:ascii="Calibri" w:cs="Calibri" w:eastAsia="Calibri" w:hAnsi="Calibri"/>
+          <w:i/>
+          <w:iCs/>
+          <w:sz w:val="21"/>
+          <w:szCs w:val="21"/>
+        </w:rPr>
+        <w:t xml:space="preserve">Prvo otvaranje nakon dužeg mirovanja može trajati 2 do 3 sekunde jer se računalo u oblaku budi. Unos i pregled rade i bez interneta; sinkronizacija se obavi kad se veza vrati.</w:t>
       </w:r>
     </w:p>
     <w:p>
@@ -1199,47 +1636,141 @@
         <w:rPr>
           <w:rFonts w:ascii="Calibri" w:cs="Calibri" w:eastAsia="Calibri" w:hAnsi="Calibri"/>
         </w:rPr>
+        <w:t xml:space="preserve">5. Ukućani</w:t>
+      </w:r>
+    </w:p>
+    <w:p>
+      <w:pPr>
+        <w:pStyle w:val="ListParagraph"/>
+        <w:numPr>
+          <w:ilvl w:val="0"/>
+          <w:numId w:val="3"/>
+        </w:numPr>
+        <w:spacing w:after="80"/>
+      </w:pPr>
+      <w:r>
+        <w:rPr>
+          <w:rFonts w:ascii="Calibri" w:cs="Calibri" w:eastAsia="Calibri" w:hAnsi="Calibri"/>
+          <w:sz w:val="22"/>
+          <w:szCs w:val="22"/>
+        </w:rPr>
+        <w:t xml:space="preserve">Svakoj osobi pošaljite adresu i pozivni kod. Svatko otvara svoj račun sa svojom e-poštom.</w:t>
+      </w:r>
+    </w:p>
+    <w:p>
+      <w:pPr>
+        <w:pStyle w:val="ListParagraph"/>
+        <w:numPr>
+          <w:ilvl w:val="0"/>
+          <w:numId w:val="3"/>
+        </w:numPr>
+        <w:spacing w:after="80"/>
+      </w:pPr>
+      <w:r>
+        <w:rPr>
+          <w:rFonts w:ascii="Calibri" w:cs="Calibri" w:eastAsia="Calibri" w:hAnsi="Calibri"/>
+          <w:sz w:val="22"/>
+          <w:szCs w:val="22"/>
+        </w:rPr>
+        <w:t xml:space="preserve">Podaci su razdvojeni po računima; nitko ne vidi tuđa mjerenja.</w:t>
+      </w:r>
+    </w:p>
+    <w:p>
+      <w:pPr>
+        <w:pStyle w:val="ListParagraph"/>
+        <w:numPr>
+          <w:ilvl w:val="0"/>
+          <w:numId w:val="3"/>
+        </w:numPr>
+        <w:spacing w:after="80"/>
+      </w:pPr>
+      <w:r>
+        <w:rPr>
+          <w:rFonts w:ascii="Calibri" w:cs="Calibri" w:eastAsia="Calibri" w:hAnsi="Calibri"/>
+          <w:sz w:val="22"/>
+          <w:szCs w:val="22"/>
+        </w:rPr>
+        <w:t xml:space="preserve">Ako netko izgubi lozinku, nova se lozinka ne može poslati e-poštom (aplikacija nema slanje e-pošte). Podaci se vraćaju iz JSON sigurnosne kopije u novi račun. Zato svakome preporučite povremenu kopiju iz Postavke → Sigurnosna kopija.</w:t>
+      </w:r>
+    </w:p>
+    <w:p>
+      <w:pPr>
+        <w:pStyle w:val="ListParagraph"/>
+        <w:numPr>
+          <w:ilvl w:val="0"/>
+          <w:numId w:val="3"/>
+        </w:numPr>
+        <w:spacing w:after="80"/>
+      </w:pPr>
+      <w:r>
+        <w:rPr>
+          <w:rFonts w:ascii="Calibri" w:cs="Calibri" w:eastAsia="Calibri" w:hAnsi="Calibri"/>
+          <w:sz w:val="22"/>
+          <w:szCs w:val="22"/>
+        </w:rPr>
+        <w:t xml:space="preserve">Želite li kasnije potpuno zatvoriti registraciju: vidi poglavlje 7, redak „Želim zatvoriti registraciju za sve”.</w:t>
+      </w:r>
+    </w:p>
+    <w:p>
+      <w:pPr>
+        <w:pStyle w:val="Heading1"/>
+        <w:spacing w:after="120" w:before="360"/>
+      </w:pPr>
+      <w:r>
+        <w:rPr>
+          <w:rFonts w:ascii="Calibri" w:cs="Calibri" w:eastAsia="Calibri" w:hAnsi="Calibri"/>
+        </w:rPr>
         <w:t xml:space="preserve">6. Nadogradnja na novu verziju</w:t>
       </w:r>
     </w:p>
     <w:p>
       <w:pPr>
-        <w:pStyle w:val="ListParagraph"/>
-        <w:numPr>
-          <w:ilvl w:val="0"/>
-          <w:numId w:val="2"/>
-        </w:numPr>
-        <w:spacing w:after="100"/>
-      </w:pPr>
-      <w:r>
-        <w:rPr>
-          <w:rFonts w:ascii="Calibri" w:cs="Calibri" w:eastAsia="Calibri" w:hAnsi="Calibri"/>
-          <w:b w:val="false"/>
-          <w:bCs w:val="false"/>
-          <w:sz w:val="22"/>
-          <w:szCs w:val="22"/>
-        </w:rPr>
-        <w:t xml:space="preserve">Preuzmite novi ZIP s GitHuba i raspakirajte ga preko postojeće mape tlak (ili zamijenite mapu).</w:t>
-      </w:r>
-    </w:p>
-    <w:p>
-      <w:pPr>
-        <w:pStyle w:val="ListParagraph"/>
-        <w:numPr>
-          <w:ilvl w:val="0"/>
-          <w:numId w:val="2"/>
-        </w:numPr>
-        <w:spacing w:after="100"/>
-      </w:pPr>
-      <w:r>
-        <w:rPr>
-          <w:rFonts w:ascii="Calibri" w:cs="Calibri" w:eastAsia="Calibri" w:hAnsi="Calibri"/>
-          <w:b w:val="false"/>
-          <w:bCs w:val="false"/>
-          <w:sz w:val="22"/>
-          <w:szCs w:val="22"/>
-        </w:rPr>
-        <w:t xml:space="preserve">U Terminalu: cd u mapu tlak, zatim fly deploy.</w:t>
+        <w:spacing w:after="120"/>
+      </w:pPr>
+      <w:r>
+        <w:rPr>
+          <w:rFonts w:ascii="Calibri" w:cs="Calibri" w:eastAsia="Calibri" w:hAnsi="Calibri"/>
+          <w:b/>
+          <w:bCs/>
+          <w:sz w:val="22"/>
+          <w:szCs w:val="22"/>
+        </w:rPr>
+        <w:t xml:space="preserve">Put A (preglednik): </w:t>
+      </w:r>
+      <w:r>
+        <w:rPr>
+          <w:rFonts w:ascii="Calibri" w:cs="Calibri" w:eastAsia="Calibri" w:hAnsi="Calibri"/>
+          <w:b w:val="false"/>
+          <w:bCs w:val="false"/>
+          <w:sz w:val="22"/>
+          <w:szCs w:val="22"/>
+        </w:rPr>
+        <w:t xml:space="preserve">GitHub → Actions → „Objavi na Fly.io” → Run workflow, s istim app_name. Kad se grana spoji u main, svaka nova verzija objavljuje se sama, bez klika.</w:t>
+      </w:r>
+    </w:p>
+    <w:p>
+      <w:pPr>
+        <w:spacing w:after="120"/>
+      </w:pPr>
+      <w:r>
+        <w:rPr>
+          <w:rFonts w:ascii="Calibri" w:cs="Calibri" w:eastAsia="Calibri" w:hAnsi="Calibri"/>
+          <w:b/>
+          <w:bCs/>
+          <w:sz w:val="22"/>
+          <w:szCs w:val="22"/>
+        </w:rPr>
+        <w:t xml:space="preserve">Put B (naredbe): </w:t>
+      </w:r>
+      <w:r>
+        <w:rPr>
+          <w:rFonts w:ascii="Calibri" w:cs="Calibri" w:eastAsia="Calibri" w:hAnsi="Calibri"/>
+          <w:b w:val="false"/>
+          <w:bCs w:val="false"/>
+          <w:sz w:val="22"/>
+          <w:szCs w:val="22"/>
+        </w:rPr>
+        <w:t xml:space="preserve">preuzmite novi ZIP, raspakirajte ga preko mape tlak, pa u Terminalu fly deploy.</w:t>
       </w:r>
     </w:p>
     <w:p>
@@ -1377,6 +1908,54 @@
                 <w:szCs w:val="20"/>
               </w:rPr>
               <w:t xml:space="preserve">Zatvorite i ponovno otvorite Terminal/PowerShell. Ako i dalje ne radi, ponovite instalaciju iz 2.2.</w:t>
+            </w:r>
+          </w:p>
+        </w:tc>
+      </w:tr>
+      <w:tr>
+        <w:tc>
+          <w:tcPr>
+            <w:tcW w:type="dxa" w:w="3000"/>
+            <w:tcMar>
+              <w:top w:type="dxa" w:w="60"/>
+              <w:left w:type="dxa" w:w="100"/>
+              <w:bottom w:type="dxa" w:w="60"/>
+              <w:right w:type="dxa" w:w="100"/>
+            </w:tcMar>
+          </w:tcPr>
+          <w:p>
+            <w:r>
+              <w:rPr>
+                <w:rFonts w:ascii="Calibri" w:cs="Calibri" w:eastAsia="Calibri" w:hAnsi="Calibri"/>
+                <w:b w:val="false"/>
+                <w:bCs w:val="false"/>
+                <w:sz w:val="20"/>
+                <w:szCs w:val="20"/>
+              </w:rPr>
+              <w:t xml:space="preserve">Objava u GitHub Actions završi crvenim križićem</w:t>
+            </w:r>
+          </w:p>
+        </w:tc>
+        <w:tc>
+          <w:tcPr>
+            <w:tcW w:type="dxa" w:w="6360"/>
+            <w:tcMar>
+              <w:top w:type="dxa" w:w="60"/>
+              <w:left w:type="dxa" w:w="100"/>
+              <w:bottom w:type="dxa" w:w="60"/>
+              <w:right w:type="dxa" w:w="100"/>
+            </w:tcMar>
+          </w:tcPr>
+          <w:p>
+            <w:r>
+              <w:rPr>
+                <w:rFonts w:ascii="Calibri" w:cs="Calibri" w:eastAsia="Calibri" w:hAnsi="Calibri"/>
+                <w:b w:val="false"/>
+                <w:bCs w:val="false"/>
+                <w:sz w:val="20"/>
+                <w:szCs w:val="20"/>
+              </w:rPr>
+              <w:t xml:space="preserve">Kliknite na neuspjeli korak, kopirajte tekst greške i pošaljite mi ga. Najčešće: zauzet naziv (promijenite FLY_APP_NAME) ili krivo zalijepljen token (napravite novi).</w:t>
             </w:r>
           </w:p>
         </w:tc>
@@ -1520,7 +2099,55 @@
                 <w:sz w:val="20"/>
                 <w:szCs w:val="20"/>
               </w:rPr>
-              <w:t xml:space="preserve">Provjerite kod: fly secrets list ne prikazuje vrijednost, ali možete ga ponovno postaviti naredbom iz koraka 3.3.</w:t>
+              <w:t xml:space="preserve">Put A: u GitHubu promijenite tajnu INVITE_CODE i ponovno pokrenite objavu. Put B: fly secrets set INVITE_CODE=novi-kod.</w:t>
+            </w:r>
+          </w:p>
+        </w:tc>
+      </w:tr>
+      <w:tr>
+        <w:tc>
+          <w:tcPr>
+            <w:tcW w:type="dxa" w:w="3000"/>
+            <w:tcMar>
+              <w:top w:type="dxa" w:w="60"/>
+              <w:left w:type="dxa" w:w="100"/>
+              <w:bottom w:type="dxa" w:w="60"/>
+              <w:right w:type="dxa" w:w="100"/>
+            </w:tcMar>
+          </w:tcPr>
+          <w:p>
+            <w:r>
+              <w:rPr>
+                <w:rFonts w:ascii="Calibri" w:cs="Calibri" w:eastAsia="Calibri" w:hAnsi="Calibri"/>
+                <w:b w:val="false"/>
+                <w:bCs w:val="false"/>
+                <w:sz w:val="20"/>
+                <w:szCs w:val="20"/>
+              </w:rPr>
+              <w:t xml:space="preserve">Želim zatvoriti registraciju za sve</w:t>
+            </w:r>
+          </w:p>
+        </w:tc>
+        <w:tc>
+          <w:tcPr>
+            <w:tcW w:type="dxa" w:w="6360"/>
+            <w:tcMar>
+              <w:top w:type="dxa" w:w="60"/>
+              <w:left w:type="dxa" w:w="100"/>
+              <w:bottom w:type="dxa" w:w="60"/>
+              <w:right w:type="dxa" w:w="100"/>
+            </w:tcMar>
+          </w:tcPr>
+          <w:p>
+            <w:r>
+              <w:rPr>
+                <w:rFonts w:ascii="Calibri" w:cs="Calibri" w:eastAsia="Calibri" w:hAnsi="Calibri"/>
+                <w:b w:val="false"/>
+                <w:bCs w:val="false"/>
+                <w:sz w:val="20"/>
+                <w:szCs w:val="20"/>
+              </w:rPr>
+              <w:t xml:space="preserve">Put A: dodajte varijablu (Variables) FLY_ALLOW_REGISTRATION s vrijednosti false i ponovno objavite. Put B: fly secrets set ALLOW_REGISTRATION=false.</w:t>
             </w:r>
           </w:p>
         </w:tc>

</xml_diff>